<commit_message>
Set MBFlex monthly to R$ 7.070,74 with CRM and Flávio bonuses
Show the previous R$ 7.457,82, the monthly/year savings, CRM implementation scope, and three V4 mentorship invites on the last slide.

Co-authored-by: sarapizzico-hue <sarapizzico-hue@users.noreply.github.com>
</commit_message>
<xml_diff>
--- a/script-mbflex-pitch.docx
+++ b/script-mbflex-pitch.docx
@@ -82,7 +82,7 @@
                 <w:color w:val="FFB4A0"/>
                 <w:sz w:val="22"/>
               </w:rPr>
-              <w:t>Márcio e Vinícius  ·  11 slides  ·  projeto 12 meses  ·  12× R$ 7.457,82</w:t>
+              <w:t>Márcio e Vinícius  ·  11 slides  ·  projeto 12 meses  ·  12× R$ 7.070,74</w:t>
             </w:r>
           </w:p>
         </w:tc>
@@ -1125,7 +1125,7 @@
                 <w:color w:val="1A1A1A"/>
                 <w:sz w:val="22"/>
               </w:rPr>
-              <w:t>CRM  ·  “vocês nunca investiram em marketing”  ·  Paulo / Renata  ·  “desconto”  ·  “fee”  ·  cartão  ·  “60/40 do P&amp;L”  ·  “a gente chega em 500 com anúncio”  ·  vender Estruturação de novo  ·  misturar lojista e motoboy no mesmo anúncio.</w:t>
+              <w:t>CRM como diagnóstico (“sem CRM”, Paulo/Renata, R$ 300)  ·  “vocês nunca investiram em marketing”  ·  “desconto”  ·  “fee”  ·  cartão  ·  “60/40 do P&amp;L”  ·  “a gente chega em 500 com anúncio”  ·  vender Estruturação de novo  ·  misturar lojista e motoboy no mesmo anúncio.</w:t>
             </w:r>
           </w:p>
         </w:tc>
@@ -4399,7 +4399,7 @@
                 <w:color w:val="1A1A1A"/>
                 <w:sz w:val="24"/>
               </w:rPr>
-              <w:t>Vocês já investiram R$ 14.612 na Estruturação. A gente reconhece isso na mensalidade — dá R$ 1.217,67 por mês — e entra uma condição comercial de R$ 2.324,51.</w:t>
+              <w:t>Vocês já investiram R$ 14.612 na Estruturação. A gente reconhece isso na mensalidade — dá R$ 1.217,67 por mês — e entra uma condição comercial de R$ 2.711,59.</w:t>
             </w:r>
           </w:p>
           <w:p>
@@ -4414,7 +4414,7 @@
                 <w:color w:val="1A1A1A"/>
                 <w:sz w:val="24"/>
               </w:rPr>
-              <w:t>Fica 12 vezes R$ 7.457,82 ao mês. É valor mensal, projeto de um ano.</w:t>
+              <w:t>A condição anterior era 12 vezes R$ 7.457,82. Fecha em 12 vezes R$ 7.070,74 ao mês. Economia de R$ 387,08 por mês, R$ 4.644,96 no ano. É valor mensal, projeto de um ano.</w:t>
             </w:r>
           </w:p>
           <w:p>
@@ -4429,7 +4429,7 @@
                 <w:color w:val="1A1A1A"/>
                 <w:sz w:val="24"/>
               </w:rPr>
-              <w:t>Dinheiro de anúncio é à parte. A conta de partida é R$ 3.500 por mês. Esse valor não sobe se a região não aguentar e se a gente não estiver vendo primeira coleta de verdade.</w:t>
+              <w:t>Dois bônus inclusos: implementação de CRM — pipes, fases, origem, dono e próxima ação, automações básicas e treino do time, sem custo de setup — e acesso com 3 convites para os Eventos V4 Company, Mentoria com Flávio Augusto.</w:t>
             </w:r>
           </w:p>
         </w:tc>
@@ -4647,7 +4647,7 @@
                 <w:color w:val="1A1A1A"/>
                 <w:sz w:val="22"/>
               </w:rPr>
-              <w:t>− R$ 2.324,51</w:t>
+              <w:t>− R$ 2.711,59</w:t>
             </w:r>
           </w:p>
         </w:tc>
@@ -4714,7 +4714,7 @@
                 <w:color w:val="FFFFFF"/>
                 <w:sz w:val="22"/>
               </w:rPr>
-              <w:t>R$ 7.457,82</w:t>
+              <w:t>R$ 7.070,74</w:t>
             </w:r>
           </w:p>
         </w:tc>
@@ -4781,7 +4781,94 @@
                 <w:color w:val="FFFFFF"/>
                 <w:sz w:val="22"/>
               </w:rPr>
-              <w:t>12 × R$ 7.457,82</w:t>
+              <w:t>12 × R$ 7.070,74</w:t>
+            </w:r>
+          </w:p>
+        </w:tc>
+      </w:tr>
+    </w:tbl>
+    <w:p>
+      <w:pPr>
+        <w:spacing w:after="160"/>
+      </w:pPr>
+    </w:p>
+    <w:tbl>
+      <w:tblPr>
+        <w:tblW w:type="auto" w:w="0"/>
+        <w:jc w:val="center"/>
+        <w:tblLayout w:type="fixed"/>
+        <w:tblLook w:firstColumn="1" w:firstRow="1" w:lastColumn="0" w:lastRow="0" w:noHBand="0" w:noVBand="1" w:val="04A0"/>
+        <w:tblW w:w="9639" w:type="dxa"/>
+      </w:tblPr>
+      <w:tblGrid>
+        <w:gridCol w:w="9752"/>
+      </w:tblGrid>
+      <w:tr>
+        <w:trPr>
+          <w:cantSplit/>
+        </w:trPr>
+        <w:tc>
+          <w:tcPr>
+            <w:tcW w:type="dxa" w:w="9752"/>
+            <w:shd w:fill="FFF8EE" w:val="clear"/>
+            <w:tcBorders>
+              <w:top w:val="single" w:sz="12" w:space="0" w:color="E50914"/>
+              <w:left w:val="single" w:sz="12" w:space="0" w:color="E50914"/>
+              <w:bottom w:val="single" w:sz="12" w:space="0" w:color="E50914"/>
+              <w:right w:val="single" w:sz="12" w:space="0" w:color="E50914"/>
+            </w:tcBorders>
+            <w:tcMar>
+              <w:top w:w="100" w:type="dxa"/>
+              <w:left w:w="140" w:type="dxa"/>
+              <w:bottom w:w="100" w:type="dxa"/>
+              <w:right w:w="140" w:type="dxa"/>
+            </w:tcMar>
+          </w:tcPr>
+          <w:p>
+            <w:pPr>
+              <w:spacing w:after="80"/>
+            </w:pPr>
+            <w:r/>
+            <w:r>
+              <w:rPr>
+                <w:rFonts w:ascii="Calibri" w:hAnsi="Calibri" w:eastAsia="Calibri"/>
+                <w:b/>
+                <w:i w:val="0"/>
+                <w:color w:val="E50914"/>
+                <w:sz w:val="18"/>
+              </w:rPr>
+              <w:t>DOIS BÔNUS NESTA CONDIÇÃO — FALA DEPOIS DO NÚMERO</w:t>
+            </w:r>
+          </w:p>
+          <w:p/>
+          <w:p>
+            <w:pPr>
+              <w:spacing w:before="0" w:after="80" w:line="276" w:lineRule="auto"/>
+            </w:pPr>
+            <w:r>
+              <w:rPr>
+                <w:rFonts w:ascii="Calibri" w:hAnsi="Calibri" w:eastAsia="Calibri"/>
+                <w:b w:val="0"/>
+                <w:i w:val="0"/>
+                <w:color w:val="1A1A1A"/>
+                <w:sz w:val="22"/>
+              </w:rPr>
+              <w:t>Implementação de CRM: pipes e fases, origem, dono e próxima ação em cada lead, automações básicas e treino do time. Incluso, sem custo de setup.</w:t>
+            </w:r>
+          </w:p>
+          <w:p>
+            <w:pPr>
+              <w:spacing w:before="0" w:after="80" w:line="276" w:lineRule="auto"/>
+            </w:pPr>
+            <w:r>
+              <w:rPr>
+                <w:rFonts w:ascii="Calibri" w:hAnsi="Calibri" w:eastAsia="Calibri"/>
+                <w:b w:val="0"/>
+                <w:i w:val="0"/>
+                <w:color w:val="1A1A1A"/>
+                <w:sz w:val="22"/>
+              </w:rPr>
+              <w:t>Eventos V4 Company: acesso com 3 convites — Mentoria com Flávio Augusto.</w:t>
             </w:r>
           </w:p>
         </w:tc>
@@ -5538,7 +5625,7 @@
                 <w:color w:val="1A1A1A"/>
                 <w:sz w:val="20"/>
               </w:rPr>
-              <w:t>Tabela 11 mil. Menos o que já investiram na Estruturação, mês a mês. Menos a condição. Fecha 7.457,82. Pode conferir: 11.000 menos 1.217,67 menos 2.324,51.</w:t>
+              <w:t>Tabela 11 mil. Menos o que já investiram na Estruturação, mês a mês. Menos a condição. Fecha 7.070,74. Era 7.457,82. Economia de 387,08 por mês. Pode conferir: 11.000 menos 1.217,67 menos 2.711,59.</w:t>
             </w:r>
           </w:p>
         </w:tc>
@@ -5641,6 +5728,73 @@
                 <w:color w:val="1A1A1A"/>
                 <w:sz w:val="20"/>
               </w:rPr>
+              <w:t>“E o CRM?”</w:t>
+            </w:r>
+          </w:p>
+        </w:tc>
+        <w:tc>
+          <w:tcPr>
+            <w:tcW w:type="dxa" w:w="4876"/>
+            <w:shd w:fill="FFFFFF" w:val="clear"/>
+            <w:tcBorders>
+              <w:top w:val="single" w:sz="4" w:space="0" w:color="E6D4D4"/>
+              <w:left w:val="single" w:sz="4" w:space="0" w:color="E6D4D4"/>
+              <w:bottom w:val="single" w:sz="4" w:space="0" w:color="E6D4D4"/>
+              <w:right w:val="single" w:sz="4" w:space="0" w:color="E6D4D4"/>
+            </w:tcBorders>
+            <w:tcMar>
+              <w:top w:w="80" w:type="dxa"/>
+              <w:left w:w="90" w:type="dxa"/>
+              <w:bottom w:w="80" w:type="dxa"/>
+              <w:right w:w="90" w:type="dxa"/>
+            </w:tcMar>
+          </w:tcPr>
+          <w:p>
+            <w:r/>
+            <w:r>
+              <w:rPr>
+                <w:rFonts w:ascii="Calibri" w:hAnsi="Calibri" w:eastAsia="Calibri"/>
+                <w:b w:val="0"/>
+                <w:i w:val="0"/>
+                <w:color w:val="1A1A1A"/>
+                <w:sz w:val="20"/>
+              </w:rPr>
+              <w:t>Entra incluso nesta condição, como bônus: implementação operacional — pipes, dono, próxima ação, automações básicas e treino. Sem custo de setup. Não é diagnóstico de “vocês não têm CRM”.</w:t>
+            </w:r>
+          </w:p>
+        </w:tc>
+      </w:tr>
+      <w:tr>
+        <w:trPr>
+          <w:cantSplit/>
+        </w:trPr>
+        <w:tc>
+          <w:tcPr>
+            <w:tcW w:type="dxa" w:w="4876"/>
+            <w:shd w:fill="F7F5F4" w:val="clear"/>
+            <w:tcBorders>
+              <w:top w:val="single" w:sz="4" w:space="0" w:color="E6D4D4"/>
+              <w:left w:val="single" w:sz="4" w:space="0" w:color="E6D4D4"/>
+              <w:bottom w:val="single" w:sz="4" w:space="0" w:color="E6D4D4"/>
+              <w:right w:val="single" w:sz="4" w:space="0" w:color="E6D4D4"/>
+            </w:tcBorders>
+            <w:tcMar>
+              <w:top w:w="80" w:type="dxa"/>
+              <w:left w:w="90" w:type="dxa"/>
+              <w:bottom w:w="80" w:type="dxa"/>
+              <w:right w:w="90" w:type="dxa"/>
+            </w:tcMar>
+          </w:tcPr>
+          <w:p>
+            <w:r/>
+            <w:r>
+              <w:rPr>
+                <w:rFonts w:ascii="Calibri" w:hAnsi="Calibri" w:eastAsia="Calibri"/>
+                <w:b/>
+                <w:i w:val="0"/>
+                <w:color w:val="1A1A1A"/>
+                <w:sz w:val="20"/>
+              </w:rPr>
               <w:t>“E o motoboy?”</w:t>
             </w:r>
           </w:p>
@@ -5648,7 +5802,7 @@
         <w:tc>
           <w:tcPr>
             <w:tcW w:type="dxa" w:w="4876"/>
-            <w:shd w:fill="FFFFFF" w:val="clear"/>
+            <w:shd w:fill="F7F5F4" w:val="clear"/>
             <w:tcBorders>
               <w:top w:val="single" w:sz="4" w:space="0" w:color="E6D4D4"/>
               <w:left w:val="single" w:sz="4" w:space="0" w:color="E6D4D4"/>
@@ -5684,7 +5838,7 @@
         <w:tc>
           <w:tcPr>
             <w:tcW w:type="dxa" w:w="4876"/>
-            <w:shd w:fill="F7F5F4" w:val="clear"/>
+            <w:shd w:fill="FFFFFF" w:val="clear"/>
             <w:tcBorders>
               <w:top w:val="single" w:sz="4" w:space="0" w:color="E6D4D4"/>
               <w:left w:val="single" w:sz="4" w:space="0" w:color="E6D4D4"/>
@@ -5715,7 +5869,7 @@
         <w:tc>
           <w:tcPr>
             <w:tcW w:type="dxa" w:w="4876"/>
-            <w:shd w:fill="F7F5F4" w:val="clear"/>
+            <w:shd w:fill="FFFFFF" w:val="clear"/>
             <w:tcBorders>
               <w:top w:val="single" w:sz="4" w:space="0" w:color="E6D4D4"/>
               <w:left w:val="single" w:sz="4" w:space="0" w:color="E6D4D4"/>
@@ -5751,7 +5905,7 @@
         <w:tc>
           <w:tcPr>
             <w:tcW w:type="dxa" w:w="4876"/>
-            <w:shd w:fill="FFFFFF" w:val="clear"/>
+            <w:shd w:fill="F7F5F4" w:val="clear"/>
             <w:tcBorders>
               <w:top w:val="single" w:sz="4" w:space="0" w:color="E6D4D4"/>
               <w:left w:val="single" w:sz="4" w:space="0" w:color="E6D4D4"/>
@@ -5782,7 +5936,7 @@
         <w:tc>
           <w:tcPr>
             <w:tcW w:type="dxa" w:w="4876"/>
-            <w:shd w:fill="FFFFFF" w:val="clear"/>
+            <w:shd w:fill="F7F5F4" w:val="clear"/>
             <w:tcBorders>
               <w:top w:val="single" w:sz="4" w:space="0" w:color="E6D4D4"/>
               <w:left w:val="single" w:sz="4" w:space="0" w:color="E6D4D4"/>
@@ -5818,7 +5972,7 @@
         <w:tc>
           <w:tcPr>
             <w:tcW w:type="dxa" w:w="4876"/>
-            <w:shd w:fill="F7F5F4" w:val="clear"/>
+            <w:shd w:fill="FFFFFF" w:val="clear"/>
             <w:tcBorders>
               <w:top w:val="single" w:sz="4" w:space="0" w:color="E6D4D4"/>
               <w:left w:val="single" w:sz="4" w:space="0" w:color="E6D4D4"/>
@@ -5849,7 +6003,7 @@
         <w:tc>
           <w:tcPr>
             <w:tcW w:type="dxa" w:w="4876"/>
-            <w:shd w:fill="F7F5F4" w:val="clear"/>
+            <w:shd w:fill="FFFFFF" w:val="clear"/>
             <w:tcBorders>
               <w:top w:val="single" w:sz="4" w:space="0" w:color="E6D4D4"/>
               <w:left w:val="single" w:sz="4" w:space="0" w:color="E6D4D4"/>
@@ -5964,7 +6118,7 @@
                 <w:color w:val="1A1A1A"/>
                 <w:sz w:val="22"/>
               </w:rPr>
-              <w:t>Estudo de conta no começo. Uma ideia por vez. Anúncio só quando a região aguenta. 500 é meta deles, não promessa sua. Um projeto de 12 meses. 12 vezes R$ 7.457,82. Pede a venda com calma.</w:t>
+              <w:t>Estudo de conta no começo. Uma ideia por vez. Anúncio só quando a região aguenta. 500 é meta deles, não promessa sua. Um projeto de 12 meses. 12 vezes R$ 7.070,74. CRM e 3 convites Flávio como bônus. Pede a venda com calma.</w:t>
             </w:r>
           </w:p>
         </w:tc>

</xml_diff>

<commit_message>
Publish MBFlex last-slide price R$ 7.070,74 plus CRM and Flávio bonuses
GitHub Pages bookmark proposta-mbflex-v4.html now shows the previous 7.457,82, the savings, CRM implementation, and three mentorship invites.

Co-authored-by: sarapizzico-hue <sarapizzico-hue@users.noreply.github.com>
</commit_message>
<xml_diff>
--- a/script-mbflex-pitch.docx
+++ b/script-mbflex-pitch.docx
@@ -82,7 +82,7 @@
                 <w:color w:val="FFB4A0"/>
                 <w:sz w:val="22"/>
               </w:rPr>
-              <w:t>Márcio e Vinícius  ·  11 slides  ·  projeto 12 meses  ·  12× R$ 7.457,82</w:t>
+              <w:t>Márcio e Vinícius  ·  11 slides  ·  projeto 12 meses  ·  12× R$ 7.070,74</w:t>
             </w:r>
           </w:p>
         </w:tc>
@@ -1125,7 +1125,7 @@
                 <w:color w:val="1A1A1A"/>
                 <w:sz w:val="22"/>
               </w:rPr>
-              <w:t>CRM  ·  “vocês nunca investiram em marketing”  ·  Paulo / Renata  ·  “desconto”  ·  “fee”  ·  cartão  ·  “60/40 do P&amp;L”  ·  “a gente chega em 500 com anúncio”  ·  vender Estruturação de novo  ·  misturar lojista e motoboy no mesmo anúncio.</w:t>
+              <w:t>CRM como diagnóstico (“sem CRM”, Paulo/Renata, R$ 300)  ·  “vocês nunca investiram em marketing”  ·  “desconto”  ·  “fee”  ·  cartão  ·  “60/40 do P&amp;L”  ·  “a gente chega em 500 com anúncio”  ·  vender Estruturação de novo  ·  misturar lojista e motoboy no mesmo anúncio.</w:t>
             </w:r>
           </w:p>
         </w:tc>
@@ -4399,7 +4399,7 @@
                 <w:color w:val="1A1A1A"/>
                 <w:sz w:val="24"/>
               </w:rPr>
-              <w:t>Vocês já investiram R$ 14.612 na Estruturação. A gente reconhece isso na mensalidade — dá R$ 1.217,67 por mês — e entra uma condição comercial de R$ 2.324,51.</w:t>
+              <w:t>Vocês já investiram R$ 14.612 na Estruturação. A gente reconhece isso na mensalidade — dá R$ 1.217,67 por mês — e entra uma condição comercial de R$ 2.711,59.</w:t>
             </w:r>
           </w:p>
           <w:p>
@@ -4414,7 +4414,7 @@
                 <w:color w:val="1A1A1A"/>
                 <w:sz w:val="24"/>
               </w:rPr>
-              <w:t>Fica 12 vezes R$ 7.457,82 ao mês. É valor mensal, projeto de um ano.</w:t>
+              <w:t>A condição anterior era 12 vezes R$ 7.457,82. Fecha em 12 vezes R$ 7.070,74 ao mês. Economia de R$ 387,08 por mês, R$ 4.644,96 no ano. É valor mensal, projeto de um ano.</w:t>
             </w:r>
           </w:p>
           <w:p>
@@ -4429,7 +4429,7 @@
                 <w:color w:val="1A1A1A"/>
                 <w:sz w:val="24"/>
               </w:rPr>
-              <w:t>Dinheiro de anúncio é à parte. A conta de partida é R$ 3.500 por mês. Esse valor não sobe se a região não aguentar e se a gente não estiver vendo primeira coleta de verdade.</w:t>
+              <w:t>Dois bônus inclusos: implementação de CRM — pipes, fases, origem, dono e próxima ação, automações básicas e treino do time, sem custo de setup — e acesso com 3 convites para os Eventos V4 Company, Mentoria com Flávio Augusto.</w:t>
             </w:r>
           </w:p>
         </w:tc>
@@ -4647,7 +4647,7 @@
                 <w:color w:val="1A1A1A"/>
                 <w:sz w:val="22"/>
               </w:rPr>
-              <w:t>− R$ 2.324,51</w:t>
+              <w:t>− R$ 2.711,59</w:t>
             </w:r>
           </w:p>
         </w:tc>
@@ -4714,7 +4714,7 @@
                 <w:color w:val="FFFFFF"/>
                 <w:sz w:val="22"/>
               </w:rPr>
-              <w:t>R$ 7.457,82</w:t>
+              <w:t>R$ 7.070,74</w:t>
             </w:r>
           </w:p>
         </w:tc>
@@ -4781,7 +4781,94 @@
                 <w:color w:val="FFFFFF"/>
                 <w:sz w:val="22"/>
               </w:rPr>
-              <w:t>12 × R$ 7.457,82</w:t>
+              <w:t>12 × R$ 7.070,74</w:t>
+            </w:r>
+          </w:p>
+        </w:tc>
+      </w:tr>
+    </w:tbl>
+    <w:p>
+      <w:pPr>
+        <w:spacing w:after="160"/>
+      </w:pPr>
+    </w:p>
+    <w:tbl>
+      <w:tblPr>
+        <w:tblW w:type="auto" w:w="0"/>
+        <w:jc w:val="center"/>
+        <w:tblLayout w:type="fixed"/>
+        <w:tblLook w:firstColumn="1" w:firstRow="1" w:lastColumn="0" w:lastRow="0" w:noHBand="0" w:noVBand="1" w:val="04A0"/>
+        <w:tblW w:w="9639" w:type="dxa"/>
+      </w:tblPr>
+      <w:tblGrid>
+        <w:gridCol w:w="9752"/>
+      </w:tblGrid>
+      <w:tr>
+        <w:trPr>
+          <w:cantSplit/>
+        </w:trPr>
+        <w:tc>
+          <w:tcPr>
+            <w:tcW w:type="dxa" w:w="9752"/>
+            <w:shd w:fill="FFF8EE" w:val="clear"/>
+            <w:tcBorders>
+              <w:top w:val="single" w:sz="12" w:space="0" w:color="E50914"/>
+              <w:left w:val="single" w:sz="12" w:space="0" w:color="E50914"/>
+              <w:bottom w:val="single" w:sz="12" w:space="0" w:color="E50914"/>
+              <w:right w:val="single" w:sz="12" w:space="0" w:color="E50914"/>
+            </w:tcBorders>
+            <w:tcMar>
+              <w:top w:w="100" w:type="dxa"/>
+              <w:left w:w="140" w:type="dxa"/>
+              <w:bottom w:w="100" w:type="dxa"/>
+              <w:right w:w="140" w:type="dxa"/>
+            </w:tcMar>
+          </w:tcPr>
+          <w:p>
+            <w:pPr>
+              <w:spacing w:after="80"/>
+            </w:pPr>
+            <w:r/>
+            <w:r>
+              <w:rPr>
+                <w:rFonts w:ascii="Calibri" w:hAnsi="Calibri" w:eastAsia="Calibri"/>
+                <w:b/>
+                <w:i w:val="0"/>
+                <w:color w:val="E50914"/>
+                <w:sz w:val="18"/>
+              </w:rPr>
+              <w:t>DOIS BÔNUS NESTA CONDIÇÃO — FALA DEPOIS DO NÚMERO</w:t>
+            </w:r>
+          </w:p>
+          <w:p/>
+          <w:p>
+            <w:pPr>
+              <w:spacing w:before="0" w:after="80" w:line="276" w:lineRule="auto"/>
+            </w:pPr>
+            <w:r>
+              <w:rPr>
+                <w:rFonts w:ascii="Calibri" w:hAnsi="Calibri" w:eastAsia="Calibri"/>
+                <w:b w:val="0"/>
+                <w:i w:val="0"/>
+                <w:color w:val="1A1A1A"/>
+                <w:sz w:val="22"/>
+              </w:rPr>
+              <w:t>Implementação de CRM: pipes e fases, origem, dono e próxima ação em cada lead, automações básicas e treino do time. Incluso, sem custo de setup.</w:t>
+            </w:r>
+          </w:p>
+          <w:p>
+            <w:pPr>
+              <w:spacing w:before="0" w:after="80" w:line="276" w:lineRule="auto"/>
+            </w:pPr>
+            <w:r>
+              <w:rPr>
+                <w:rFonts w:ascii="Calibri" w:hAnsi="Calibri" w:eastAsia="Calibri"/>
+                <w:b w:val="0"/>
+                <w:i w:val="0"/>
+                <w:color w:val="1A1A1A"/>
+                <w:sz w:val="22"/>
+              </w:rPr>
+              <w:t>Eventos V4 Company: acesso com 3 convites — Mentoria com Flávio Augusto.</w:t>
             </w:r>
           </w:p>
         </w:tc>
@@ -5538,7 +5625,7 @@
                 <w:color w:val="1A1A1A"/>
                 <w:sz w:val="20"/>
               </w:rPr>
-              <w:t>Tabela 11 mil. Menos o que já investiram na Estruturação, mês a mês. Menos a condição. Fecha 7.457,82. Pode conferir: 11.000 menos 1.217,67 menos 2.324,51.</w:t>
+              <w:t>Tabela 11 mil. Menos o que já investiram na Estruturação, mês a mês. Menos a condição. Fecha 7.070,74. Era 7.457,82. Economia de 387,08 por mês. Pode conferir: 11.000 menos 1.217,67 menos 2.711,59.</w:t>
             </w:r>
           </w:p>
         </w:tc>
@@ -5641,6 +5728,73 @@
                 <w:color w:val="1A1A1A"/>
                 <w:sz w:val="20"/>
               </w:rPr>
+              <w:t>“E o CRM?”</w:t>
+            </w:r>
+          </w:p>
+        </w:tc>
+        <w:tc>
+          <w:tcPr>
+            <w:tcW w:type="dxa" w:w="4876"/>
+            <w:shd w:fill="FFFFFF" w:val="clear"/>
+            <w:tcBorders>
+              <w:top w:val="single" w:sz="4" w:space="0" w:color="E6D4D4"/>
+              <w:left w:val="single" w:sz="4" w:space="0" w:color="E6D4D4"/>
+              <w:bottom w:val="single" w:sz="4" w:space="0" w:color="E6D4D4"/>
+              <w:right w:val="single" w:sz="4" w:space="0" w:color="E6D4D4"/>
+            </w:tcBorders>
+            <w:tcMar>
+              <w:top w:w="80" w:type="dxa"/>
+              <w:left w:w="90" w:type="dxa"/>
+              <w:bottom w:w="80" w:type="dxa"/>
+              <w:right w:w="90" w:type="dxa"/>
+            </w:tcMar>
+          </w:tcPr>
+          <w:p>
+            <w:r/>
+            <w:r>
+              <w:rPr>
+                <w:rFonts w:ascii="Calibri" w:hAnsi="Calibri" w:eastAsia="Calibri"/>
+                <w:b w:val="0"/>
+                <w:i w:val="0"/>
+                <w:color w:val="1A1A1A"/>
+                <w:sz w:val="20"/>
+              </w:rPr>
+              <w:t>Entra incluso nesta condição, como bônus: implementação operacional — pipes, dono, próxima ação, automações básicas e treino. Sem custo de setup. Não é diagnóstico de “vocês não têm CRM”.</w:t>
+            </w:r>
+          </w:p>
+        </w:tc>
+      </w:tr>
+      <w:tr>
+        <w:trPr>
+          <w:cantSplit/>
+        </w:trPr>
+        <w:tc>
+          <w:tcPr>
+            <w:tcW w:type="dxa" w:w="4876"/>
+            <w:shd w:fill="F7F5F4" w:val="clear"/>
+            <w:tcBorders>
+              <w:top w:val="single" w:sz="4" w:space="0" w:color="E6D4D4"/>
+              <w:left w:val="single" w:sz="4" w:space="0" w:color="E6D4D4"/>
+              <w:bottom w:val="single" w:sz="4" w:space="0" w:color="E6D4D4"/>
+              <w:right w:val="single" w:sz="4" w:space="0" w:color="E6D4D4"/>
+            </w:tcBorders>
+            <w:tcMar>
+              <w:top w:w="80" w:type="dxa"/>
+              <w:left w:w="90" w:type="dxa"/>
+              <w:bottom w:w="80" w:type="dxa"/>
+              <w:right w:w="90" w:type="dxa"/>
+            </w:tcMar>
+          </w:tcPr>
+          <w:p>
+            <w:r/>
+            <w:r>
+              <w:rPr>
+                <w:rFonts w:ascii="Calibri" w:hAnsi="Calibri" w:eastAsia="Calibri"/>
+                <w:b/>
+                <w:i w:val="0"/>
+                <w:color w:val="1A1A1A"/>
+                <w:sz w:val="20"/>
+              </w:rPr>
               <w:t>“E o motoboy?”</w:t>
             </w:r>
           </w:p>
@@ -5648,7 +5802,7 @@
         <w:tc>
           <w:tcPr>
             <w:tcW w:type="dxa" w:w="4876"/>
-            <w:shd w:fill="FFFFFF" w:val="clear"/>
+            <w:shd w:fill="F7F5F4" w:val="clear"/>
             <w:tcBorders>
               <w:top w:val="single" w:sz="4" w:space="0" w:color="E6D4D4"/>
               <w:left w:val="single" w:sz="4" w:space="0" w:color="E6D4D4"/>
@@ -5684,7 +5838,7 @@
         <w:tc>
           <w:tcPr>
             <w:tcW w:type="dxa" w:w="4876"/>
-            <w:shd w:fill="F7F5F4" w:val="clear"/>
+            <w:shd w:fill="FFFFFF" w:val="clear"/>
             <w:tcBorders>
               <w:top w:val="single" w:sz="4" w:space="0" w:color="E6D4D4"/>
               <w:left w:val="single" w:sz="4" w:space="0" w:color="E6D4D4"/>
@@ -5715,7 +5869,7 @@
         <w:tc>
           <w:tcPr>
             <w:tcW w:type="dxa" w:w="4876"/>
-            <w:shd w:fill="F7F5F4" w:val="clear"/>
+            <w:shd w:fill="FFFFFF" w:val="clear"/>
             <w:tcBorders>
               <w:top w:val="single" w:sz="4" w:space="0" w:color="E6D4D4"/>
               <w:left w:val="single" w:sz="4" w:space="0" w:color="E6D4D4"/>
@@ -5751,7 +5905,7 @@
         <w:tc>
           <w:tcPr>
             <w:tcW w:type="dxa" w:w="4876"/>
-            <w:shd w:fill="FFFFFF" w:val="clear"/>
+            <w:shd w:fill="F7F5F4" w:val="clear"/>
             <w:tcBorders>
               <w:top w:val="single" w:sz="4" w:space="0" w:color="E6D4D4"/>
               <w:left w:val="single" w:sz="4" w:space="0" w:color="E6D4D4"/>
@@ -5782,7 +5936,7 @@
         <w:tc>
           <w:tcPr>
             <w:tcW w:type="dxa" w:w="4876"/>
-            <w:shd w:fill="FFFFFF" w:val="clear"/>
+            <w:shd w:fill="F7F5F4" w:val="clear"/>
             <w:tcBorders>
               <w:top w:val="single" w:sz="4" w:space="0" w:color="E6D4D4"/>
               <w:left w:val="single" w:sz="4" w:space="0" w:color="E6D4D4"/>
@@ -5818,7 +5972,7 @@
         <w:tc>
           <w:tcPr>
             <w:tcW w:type="dxa" w:w="4876"/>
-            <w:shd w:fill="F7F5F4" w:val="clear"/>
+            <w:shd w:fill="FFFFFF" w:val="clear"/>
             <w:tcBorders>
               <w:top w:val="single" w:sz="4" w:space="0" w:color="E6D4D4"/>
               <w:left w:val="single" w:sz="4" w:space="0" w:color="E6D4D4"/>
@@ -5849,7 +6003,7 @@
         <w:tc>
           <w:tcPr>
             <w:tcW w:type="dxa" w:w="4876"/>
-            <w:shd w:fill="F7F5F4" w:val="clear"/>
+            <w:shd w:fill="FFFFFF" w:val="clear"/>
             <w:tcBorders>
               <w:top w:val="single" w:sz="4" w:space="0" w:color="E6D4D4"/>
               <w:left w:val="single" w:sz="4" w:space="0" w:color="E6D4D4"/>
@@ -5964,7 +6118,7 @@
                 <w:color w:val="1A1A1A"/>
                 <w:sz w:val="22"/>
               </w:rPr>
-              <w:t>Estudo de conta no começo. Uma ideia por vez. Anúncio só quando a região aguenta. 500 é meta deles, não promessa sua. Um projeto de 12 meses. 12 vezes R$ 7.457,82. Pede a venda com calma.</w:t>
+              <w:t>Estudo de conta no começo. Uma ideia por vez. Anúncio só quando a região aguenta. 500 é meta deles, não promessa sua. Um projeto de 12 meses. 12 vezes R$ 7.070,74. CRM e 3 convites Flávio como bônus. Pede a venda com calma.</w:t>
             </w:r>
           </w:p>
         </w:tc>

</xml_diff>